<commit_message>
Update intern database and design.docx
</commit_message>
<xml_diff>
--- a/intern database and design.docx
+++ b/intern database and design.docx
@@ -138,10 +138,10 @@
       <w:r>
         <w:lastRenderedPageBreak/>
         <w:drawing>
-          <wp:inline distT="0" distB="0" distL="0" distR="0" wp14:anchorId="587E43EF" wp14:editId="459CB733">
-            <wp:extent cx="2902585" cy="8229600"/>
-            <wp:effectExtent l="0" t="0" r="0" b="0"/>
-            <wp:docPr id="5" name="Picture 5"/>
+          <wp:inline distT="0" distB="0" distL="0" distR="0" wp14:anchorId="43D54A13" wp14:editId="74E30B6B">
+            <wp:extent cx="2910205" cy="8229600"/>
+            <wp:effectExtent l="0" t="0" r="4445" b="0"/>
+            <wp:docPr id="6" name="Picture 6"/>
             <wp:cNvGraphicFramePr>
               <a:graphicFrameLocks xmlns:a="http://schemas.openxmlformats.org/drawingml/2006/main" noChangeAspect="1"/>
             </wp:cNvGraphicFramePr>
@@ -170,7 +170,7 @@
                   <pic:spPr bwMode="auto">
                     <a:xfrm>
                       <a:off x="0" y="0"/>
-                      <a:ext cx="2902585" cy="8229600"/>
+                      <a:ext cx="2910205" cy="8229600"/>
                     </a:xfrm>
                     <a:prstGeom prst="rect">
                       <a:avLst/>
@@ -187,6 +187,7 @@
         </w:drawing>
       </w:r>
     </w:p>
+    <w:p/>
     <w:p/>
     <w:sectPr>
       <w:pgSz w:w="12240" w:h="15840"/>

</xml_diff>